<commit_message>
revised concept docs following Jos input
</commit_message>
<xml_diff>
--- a/docs/assets/quiet_concept_overview.docx
+++ b/docs/assets/quiet_concept_overview.docx
@@ -3246,7 +3246,7 @@
           <w:szCs w:val="18"/>
         </w:rPr>
         <w:drawing>
-          <wp:inline distT="0" distB="0" distL="0" distR="0" wp14:anchorId="692A05E4" wp14:editId="35FF90CC">
+          <wp:inline distT="0" distB="0" distL="0" distR="0" wp14:anchorId="692A05E4" wp14:editId="28557CAA">
             <wp:extent cx="5731510" cy="6879590"/>
             <wp:effectExtent l="0" t="0" r="0" b="3810"/>
             <wp:docPr id="962872546" name="Picture 1"/>
@@ -3309,7 +3309,7 @@
         </w:rPr>
         <w:lastRenderedPageBreak/>
         <w:drawing>
-          <wp:inline distT="0" distB="0" distL="0" distR="0" wp14:anchorId="51540622" wp14:editId="1898B90B">
+          <wp:inline distT="0" distB="0" distL="0" distR="0" wp14:anchorId="51540622" wp14:editId="3735DC69">
             <wp:extent cx="5731510" cy="6083300"/>
             <wp:effectExtent l="0" t="0" r="0" b="0"/>
             <wp:docPr id="367379426" name="Picture 2"/>

</xml_diff>